<commit_message>
Revisions after NoA desk rejection: documented-plan framing, roles of author and AI (Methods 2.9), cohort heterogeneity (Table 1, Limitations), GSE36980 age-filter deviation
</commit_message>
<xml_diff>
--- a/manuscript/drafts/supplementary_file2_NoA.docx
+++ b/manuscript/drafts/supplementary_file2_NoA.docx
@@ -1036,6 +1036,76 @@
                 <w:rFonts w:ascii="Times New Roman" w:hAnsi="Times New Roman"/>
                 <w:sz w:val="20"/>
               </w:rPr>
+              <w:t xml:space="preserve">Stage 4: age ≥ 65 years for GSE48350</w:t>
+            </w:r>
+          </w:p>
+        </w:tc>
+        <w:tc>
+          <w:tcPr/>
+          <w:p>
+            <w:pPr>
+              <w:pStyle w:val="Compact"/>
+              <w:spacing w:line="240" w:lineRule="auto" w:after="0"/>
+              <w:jc w:val="left"/>
+            </w:pPr>
+            <w:r>
+              <w:rPr>
+                <w:rFonts w:ascii="Times New Roman" w:hAnsi="Times New Roman"/>
+                <w:sz w:val="20"/>
+              </w:rPr>
+              <w:t xml:space="preserve">Also applied to GSE36980 (one control aged 55 excluded)</w:t>
+            </w:r>
+          </w:p>
+        </w:tc>
+        <w:tc>
+          <w:tcPr/>
+          <w:p>
+            <w:pPr>
+              <w:pStyle w:val="Compact"/>
+              <w:spacing w:line="240" w:lineRule="auto" w:after="0"/>
+              <w:jc w:val="left"/>
+            </w:pPr>
+            <w:r>
+              <w:rPr>
+                <w:rFonts w:ascii="Times New Roman" w:hAnsi="Times New Roman"/>
+                <w:sz w:val="20"/>
+              </w:rPr>
+              <w:t xml:space="preserve">Consistency between datasets</w:t>
+            </w:r>
+          </w:p>
+        </w:tc>
+        <w:tc>
+          <w:tcPr/>
+          <w:p>
+            <w:pPr>
+              <w:pStyle w:val="Compact"/>
+              <w:spacing w:line="240" w:lineRule="auto" w:after="0"/>
+              <w:jc w:val="left"/>
+            </w:pPr>
+            <w:r>
+              <w:rPr>
+                <w:rFonts w:ascii="Times New Roman" w:hAnsi="Times New Roman"/>
+                <w:sz w:val="20"/>
+              </w:rPr>
+              <w:t xml:space="preserve">Applied in code; documented 2026-09-29</w:t>
+            </w:r>
+          </w:p>
+        </w:tc>
+      </w:tr>
+      <w:tr>
+        <w:tc>
+          <w:tcPr/>
+          <w:p>
+            <w:pPr>
+              <w:pStyle w:val="Compact"/>
+              <w:spacing w:line="240" w:lineRule="auto" w:after="0"/>
+              <w:jc w:val="left"/>
+            </w:pPr>
+            <w:r>
+              <w:rPr>
+                <w:rFonts w:ascii="Times New Roman" w:hAnsi="Times New Roman"/>
+                <w:sz w:val="20"/>
+              </w:rPr>
               <w:t xml:space="preserve">Stage 4: ComBat preserves diagnosis and region</w:t>
             </w:r>
           </w:p>
@@ -2263,6 +2333,76 @@
                 <w:sz w:val="20"/>
               </w:rPr>
               <w:t xml:space="preserve">Cohort rebuilt with SRA-accession matching (R/12_0); A1 and Section 3.6 re-run; H1 decision unchanged (0.074 before, 0.082 after)</w:t>
+            </w:r>
+          </w:p>
+        </w:tc>
+      </w:tr>
+      <w:tr>
+        <w:tc>
+          <w:tcPr/>
+          <w:p>
+            <w:pPr>
+              <w:pStyle w:val="Compact"/>
+              <w:spacing w:line="240" w:lineRule="auto" w:after="0"/>
+              <w:jc w:val="left"/>
+            </w:pPr>
+            <w:r>
+              <w:rPr>
+                <w:rFonts w:ascii="Times New Roman" w:hAnsi="Times New Roman"/>
+                <w:sz w:val="20"/>
+              </w:rPr>
+              <w:t xml:space="preserve">2026-09-29</w:t>
+            </w:r>
+          </w:p>
+        </w:tc>
+        <w:tc>
+          <w:tcPr/>
+          <w:p>
+            <w:pPr>
+              <w:pStyle w:val="Compact"/>
+              <w:spacing w:line="240" w:lineRule="auto" w:after="0"/>
+              <w:jc w:val="left"/>
+            </w:pPr>
+            <w:r>
+              <w:rPr>
+                <w:rFonts w:ascii="Times New Roman" w:hAnsi="Times New Roman"/>
+                <w:sz w:val="20"/>
+              </w:rPr>
+              <w:t xml:space="preserve">Age criterion of GSE48350 also applied to GSE36980 without documentation</w:t>
+            </w:r>
+          </w:p>
+        </w:tc>
+        <w:tc>
+          <w:tcPr/>
+          <w:p>
+            <w:pPr>
+              <w:pStyle w:val="Compact"/>
+              <w:spacing w:line="240" w:lineRule="auto" w:after="0"/>
+              <w:jc w:val="left"/>
+            </w:pPr>
+            <w:r>
+              <w:rPr>
+                <w:rFonts w:ascii="Times New Roman" w:hAnsi="Times New Roman"/>
+                <w:sz w:val="20"/>
+              </w:rPr>
+              <w:t xml:space="preserve">One control (GSM907865) excluded</w:t>
+            </w:r>
+          </w:p>
+        </w:tc>
+        <w:tc>
+          <w:tcPr/>
+          <w:p>
+            <w:pPr>
+              <w:pStyle w:val="Compact"/>
+              <w:spacing w:line="240" w:lineRule="auto" w:after="0"/>
+              <w:jc w:val="left"/>
+            </w:pPr>
+            <w:r>
+              <w:rPr>
+                <w:rFonts w:ascii="Times New Roman" w:hAnsi="Times New Roman"/>
+                <w:sz w:val="20"/>
+              </w:rPr>
+              <w:t xml:space="preserve">Documented as a deviation (Table A)</w:t>
             </w:r>
           </w:p>
         </w:tc>

</xml_diff>